<commit_message>
Revise since special issue has closed
</commit_message>
<xml_diff>
--- a/submission/cover_letter.docx
+++ b/submission/cover_letter.docx
@@ -209,7 +209,25 @@
                                   <w:sz w:val="18"/>
                                   <w:szCs w:val="18"/>
                                 </w:rPr>
-                                <w:t>FAX:  (734) 764-3562</w:t>
+                                <w:t>FAX</w:t>
+                              </w:r>
+                              <w:proofErr w:type="gramStart"/>
+                              <w:r>
+                                <w:rPr>
+                                  <w:color w:val="071F5F"/>
+                                  <w:sz w:val="18"/>
+                                  <w:szCs w:val="18"/>
+                                </w:rPr>
+                                <w:t>:  (</w:t>
+                              </w:r>
+                              <w:proofErr w:type="gramEnd"/>
+                              <w:r>
+                                <w:rPr>
+                                  <w:color w:val="071F5F"/>
+                                  <w:sz w:val="18"/>
+                                  <w:szCs w:val="18"/>
+                                </w:rPr>
+                                <w:t>734) 764-3562</w:t>
                               </w:r>
                             </w:p>
                           </w:txbxContent>
@@ -450,7 +468,21 @@
           <w:rFonts w:cs="Arial"/>
           <w:szCs w:val="22"/>
         </w:rPr>
-        <w:t>June 22, 2026</w:t>
+        <w:t>June 2</w:t>
+      </w:r>
+      <w:r>
+        <w:rPr>
+          <w:rFonts w:cs="Arial"/>
+          <w:szCs w:val="22"/>
+        </w:rPr>
+        <w:t>6</w:t>
+      </w:r>
+      <w:r>
+        <w:rPr>
+          <w:rFonts w:cs="Arial"/>
+          <w:szCs w:val="22"/>
+        </w:rPr>
+        <w:t>, 2026</w:t>
       </w:r>
     </w:p>
     <w:p>
@@ -573,6 +605,7 @@
         </w:rPr>
         <w:t xml:space="preserve">manuscript, </w:t>
       </w:r>
+      <w:proofErr w:type="spellStart"/>
       <w:r>
         <w:rPr>
           <w:rFonts w:cs="Arial"/>
@@ -580,7 +613,17 @@
           <w:bCs/>
           <w:szCs w:val="22"/>
         </w:rPr>
-        <w:t>strollur: An R package for working with amplicon sequence data in R</w:t>
+        <w:t>strollur</w:t>
+      </w:r>
+      <w:proofErr w:type="spellEnd"/>
+      <w:r>
+        <w:rPr>
+          <w:rFonts w:cs="Arial"/>
+          <w:b/>
+          <w:bCs/>
+          <w:szCs w:val="22"/>
+        </w:rPr>
+        <w:t>: An R package for working with amplicon sequence data in R</w:t>
       </w:r>
       <w:r>
         <w:rPr>
@@ -638,7 +681,14 @@
           <w:rFonts w:cs="Arial"/>
           <w:szCs w:val="22"/>
         </w:rPr>
-        <w:t>We think this will be an important contribution. We would be delighted to have it included in the special issue MRA is preparing for software tool announcements.</w:t>
+        <w:t>We think this will be an important contribution</w:t>
+      </w:r>
+      <w:r>
+        <w:rPr>
+          <w:rFonts w:cs="Arial"/>
+          <w:szCs w:val="22"/>
+        </w:rPr>
+        <w:t xml:space="preserve"> within the Software and Database section of the journal.</w:t>
       </w:r>
     </w:p>
     <w:p>

</xml_diff>